<commit_message>
Finalize Lab 2 report template corrections
</commit_message>
<xml_diff>
--- a/labbs/lab2/DT081A_Lab2_Report_Jakob_Obid_REVISED.docx
+++ b/labbs/lab2/DT081A_Lab2_Report_Jakob_Obid_REVISED.docx
@@ -27,22 +27,22 @@
         <w:rPr>
           <w:b/>
         </w:rPr>
-        <w:t xml:space="preserve">Yacoub Dawli </w:t>
+        <w:t xml:space="preserve">Yacoub Dawli (Jakob)</w:t>
       </w:r>
       <w:r>
-        <w:t>/</w:t>
+        <w:t xml:space="preserve"> — yada2100@student.miun.se</w:t>
       </w:r>
       <w:r>
-        <w:t xml:space="preserve"> yada2100</w:t>
+        <w:br/>
       </w:r>
       <w:r>
-        <w:t>]   ·   Obid [</w:t>
+        <w:rPr>
+          <w:b/>
+        </w:rPr>
+        <w:t xml:space="preserve">Obid Alrhman Aljabi</w:t>
       </w:r>
       <w:r>
-        <w:t>Obid Alrhman Aljabi / obal2302</w:t>
-      </w:r>
-      <w:r>
-        <w:t>]       22 October 2026</w:t>
+        <w:t xml:space="preserve"> — obal2302@student.miun.se       22 October 2026</w:t>
       </w:r>
     </w:p>
     <w:p>
@@ -1423,6 +1423,36 @@
         </w:rPr>
       </w:pPr>
       <w:r>
+        <w:t xml:space="preserve">The FFT finds the frequencies in the signal, while np.angle() gives their phases.</w:t>
+      </w:r>
+    </w:p>
+    <w:p>
+      <w:pPr>
+        <w:rPr>
+          <w:rFonts w:hint="eastAsia"/>
+        </w:rPr>
+      </w:pPr>
+      <w:r>
+        <w:t xml:space="preserve">lfilter() calculates the system output. The Butterworth commands set up a low-pass filter and filters that keep or remove the 150–400 Hz band.</w:t>
+      </w:r>
+    </w:p>
+    <w:p>
+      <w:pPr>
+        <w:rPr>
+          <w:rFonts w:hint="eastAsia"/>
+        </w:rPr>
+      </w:pPr>
+      <w:r>
+        <w:t xml:space="preserve">For the voice recordings, axis=1 applies the FFT to each short part. Squaring its magnitude gives the power shown in the spectrogram.</w:t>
+      </w:r>
+    </w:p>
+    <w:p>
+      <w:pPr>
+        <w:rPr>
+          <w:rFonts w:hint="eastAsia"/>
+        </w:rPr>
+      </w:pPr>
+      <w:r>
         <w:t>Source: DT081A Lab 2 instructions and course lectures 4–7. Full code and other figures are kept with the lab files.</w:t>
       </w:r>
     </w:p>

</xml_diff>

<commit_message>
Add missing Lab 2 report figures
</commit_message>
<xml_diff>
--- a/labbs/lab2/DT081A_Lab2_Report_Jakob_Obid_REVISED.docx
+++ b/labbs/lab2/DT081A_Lab2_Report_Jakob_Obid_REVISED.docx
@@ -109,6 +109,7 @@
     </w:p>
     <w:p>
       <w:pPr>
+        <w:keepNext/>
         <w:spacing w:before="60" w:after="40"/>
         <w:jc w:val="center"/>
         <w:rPr>
@@ -188,6 +189,7 @@
     </w:p>
     <w:p>
       <w:pPr>
+        <w:keepNext/>
         <w:spacing w:before="60" w:after="40"/>
         <w:jc w:val="center"/>
         <w:rPr>
@@ -267,12 +269,114 @@
     </w:p>
     <w:p>
       <w:pPr>
+        <w:keepNext/>
+        <w:keepLines/>
+        <w:spacing w:before="60" w:after="20" w:line="240" w:lineRule="auto"/>
+        <w:jc w:val="center"/>
+      </w:pPr>
+      <w:r>
+        <w:drawing>
+          <wp:inline xmlns:a="http://schemas.openxmlformats.org/drawingml/2006/main" xmlns:pic="http://schemas.openxmlformats.org/drawingml/2006/picture">
+            <wp:extent cx="4572000" cy="1778000"/>
+            <wp:docPr id="5" name="Picture 5" descr="Figure 3. System 1 impulse response: eight nonzero samples, then zeros."/>
+            <wp:cNvGraphicFramePr>
+              <a:graphicFrameLocks noChangeAspect="1"/>
+            </wp:cNvGraphicFramePr>
+            <a:graphic>
+              <a:graphicData uri="http://schemas.openxmlformats.org/drawingml/2006/picture">
+                <pic:pic>
+                  <pic:nvPicPr>
+                    <pic:cNvPr id="0" name="section3_system1_convolution.png"/>
+                    <pic:cNvPicPr/>
+                  </pic:nvPicPr>
+                  <pic:blipFill>
+                    <a:blip r:embed="rId16"/>
+                    <a:stretch>
+                      <a:fillRect/>
+                    </a:stretch>
+                  </pic:blipFill>
+                  <pic:spPr>
+                    <a:xfrm>
+                      <a:off x="0" y="0"/>
+                      <a:ext cx="4572000" cy="1778000"/>
+                    </a:xfrm>
+                    <a:prstGeom prst="rect"/>
+                  </pic:spPr>
+                </pic:pic>
+              </a:graphicData>
+            </a:graphic>
+          </wp:inline>
+        </w:drawing>
+      </w:r>
+    </w:p>
+    <w:p>
+      <w:pPr>
+        <w:pStyle w:val="Beskrivning"/>
+        <w:keepNext w:val="0"/>
+        <w:keepLines/>
+        <w:jc w:val="center"/>
         <w:rPr>
           <w:rFonts w:hint="eastAsia"/>
         </w:rPr>
       </w:pPr>
       <w:r>
-        <w:br w:type="page"/>
+        <w:t>Figure 3. System 1 impulse response: eight nonzero samples, then zeros.</w:t>
+      </w:r>
+    </w:p>
+    <w:p>
+      <w:pPr>
+        <w:keepNext/>
+        <w:keepLines/>
+        <w:spacing w:before="60" w:after="20" w:line="240" w:lineRule="auto"/>
+        <w:jc w:val="center"/>
+      </w:pPr>
+      <w:r>
+        <w:drawing>
+          <wp:inline xmlns:a="http://schemas.openxmlformats.org/drawingml/2006/main" xmlns:pic="http://schemas.openxmlformats.org/drawingml/2006/picture">
+            <wp:extent cx="4572000" cy="3048000"/>
+            <wp:docPr id="6" name="Picture 6" descr="Figure 4. System 2: matching 100-sample responses from the loop and SciPy lfilter."/>
+            <wp:cNvGraphicFramePr>
+              <a:graphicFrameLocks noChangeAspect="1"/>
+            </wp:cNvGraphicFramePr>
+            <a:graphic>
+              <a:graphicData uri="http://schemas.openxmlformats.org/drawingml/2006/picture">
+                <pic:pic>
+                  <pic:nvPicPr>
+                    <pic:cNvPr id="0" name="section3_system2_comparison.png"/>
+                    <pic:cNvPicPr/>
+                  </pic:nvPicPr>
+                  <pic:blipFill>
+                    <a:blip r:embed="rId17"/>
+                    <a:stretch>
+                      <a:fillRect/>
+                    </a:stretch>
+                  </pic:blipFill>
+                  <pic:spPr>
+                    <a:xfrm>
+                      <a:off x="0" y="0"/>
+                      <a:ext cx="4572000" cy="3048000"/>
+                    </a:xfrm>
+                    <a:prstGeom prst="rect"/>
+                  </pic:spPr>
+                </pic:pic>
+              </a:graphicData>
+            </a:graphic>
+          </wp:inline>
+        </w:drawing>
+      </w:r>
+    </w:p>
+    <w:p>
+      <w:pPr>
+        <w:pStyle w:val="Beskrivning"/>
+        <w:keepNext w:val="0"/>
+        <w:keepLines/>
+        <w:jc w:val="center"/>
+        <w:rPr>
+          <w:rFonts w:hint="eastAsia"/>
+        </w:rPr>
+      </w:pPr>
+      <w:r>
+        <w:t>Figure 4. System 2: matching 100-sample responses from the loop and SciPy lfilter.</w:t>
       </w:r>
     </w:p>
     <w:p>
@@ -671,11 +775,59 @@
     </w:tbl>
     <w:p>
       <w:pPr>
-        <w:spacing w:after="0"/>
+        <w:keepNext/>
+        <w:keepLines/>
+        <w:spacing w:before="80" w:after="20" w:line="240" w:lineRule="auto"/>
+        <w:jc w:val="center"/>
+      </w:pPr>
+      <w:r>
+        <w:drawing>
+          <wp:inline xmlns:a="http://schemas.openxmlformats.org/drawingml/2006/main" xmlns:pic="http://schemas.openxmlformats.org/drawingml/2006/picture">
+            <wp:extent cx="5943600" cy="2161309"/>
+            <wp:docPr id="7" name="Picture 7" descr="Figure 5. The signal’s amplitude spectrum (raw FFT magnitude) and phase spectrum."/>
+            <wp:cNvGraphicFramePr>
+              <a:graphicFrameLocks noChangeAspect="1"/>
+            </wp:cNvGraphicFramePr>
+            <a:graphic>
+              <a:graphicData uri="http://schemas.openxmlformats.org/drawingml/2006/picture">
+                <pic:pic>
+                  <pic:nvPicPr>
+                    <pic:cNvPr id="0" name="section4_amplitude_phase.png"/>
+                    <pic:cNvPicPr/>
+                  </pic:nvPicPr>
+                  <pic:blipFill>
+                    <a:blip r:embed="rId18"/>
+                    <a:stretch>
+                      <a:fillRect/>
+                    </a:stretch>
+                  </pic:blipFill>
+                  <pic:spPr>
+                    <a:xfrm>
+                      <a:off x="0" y="0"/>
+                      <a:ext cx="5943600" cy="2161309"/>
+                    </a:xfrm>
+                    <a:prstGeom prst="rect"/>
+                  </pic:spPr>
+                </pic:pic>
+              </a:graphicData>
+            </a:graphic>
+          </wp:inline>
+        </w:drawing>
+      </w:r>
+    </w:p>
+    <w:p>
+      <w:pPr>
+        <w:pStyle w:val="Beskrivning"/>
+        <w:keepNext w:val="0"/>
+        <w:keepLines/>
+        <w:jc w:val="center"/>
         <w:rPr>
           <w:rFonts w:hint="eastAsia"/>
         </w:rPr>
       </w:pPr>
+      <w:r>
+        <w:t>Figure 5. The signal’s amplitude spectrum (raw FFT magnitude) and phase spectrum.</w:t>
+      </w:r>
     </w:p>
     <w:p>
       <w:pPr>
@@ -693,6 +845,62 @@
       </w:pPr>
       <w:r>
         <w:t>We passed a 50 Hz cosine through System 2. Its amplitude dropped from 1.0 to 0.7481 and its phase shifted to −0.0103 radians. The system response predicted an amplitude of 0.7454 and a phase of −0.0128 radians. The amplitude difference was about 0.37%. This is small and is explained by the short recording and the filter’s start-up behavior. The result supports Y(f) = H(f)X(f).</w:t>
+      </w:r>
+    </w:p>
+    <w:p>
+      <w:pPr>
+        <w:keepNext/>
+        <w:keepLines/>
+        <w:spacing w:before="60" w:after="20" w:line="240" w:lineRule="auto"/>
+        <w:jc w:val="center"/>
+      </w:pPr>
+      <w:r>
+        <w:drawing>
+          <wp:inline xmlns:a="http://schemas.openxmlformats.org/drawingml/2006/main" xmlns:pic="http://schemas.openxmlformats.org/drawingml/2006/picture">
+            <wp:extent cx="5943600" cy="2161309"/>
+            <wp:docPr id="8" name="Picture 8" descr="Figure 6. System 2 amplification and phase shift as functions of frequency."/>
+            <wp:cNvGraphicFramePr>
+              <a:graphicFrameLocks noChangeAspect="1"/>
+            </wp:cNvGraphicFramePr>
+            <a:graphic>
+              <a:graphicData uri="http://schemas.openxmlformats.org/drawingml/2006/picture">
+                <pic:pic>
+                  <pic:nvPicPr>
+                    <pic:cNvPr id="0" name="section5_system_frequency_response.png"/>
+                    <pic:cNvPicPr/>
+                  </pic:nvPicPr>
+                  <pic:blipFill>
+                    <a:blip r:embed="rId19"/>
+                    <a:stretch>
+                      <a:fillRect/>
+                    </a:stretch>
+                  </pic:blipFill>
+                  <pic:spPr>
+                    <a:xfrm>
+                      <a:off x="0" y="0"/>
+                      <a:ext cx="5943600" cy="2161309"/>
+                    </a:xfrm>
+                    <a:prstGeom prst="rect"/>
+                  </pic:spPr>
+                </pic:pic>
+              </a:graphicData>
+            </a:graphic>
+          </wp:inline>
+        </w:drawing>
+      </w:r>
+    </w:p>
+    <w:p>
+      <w:pPr>
+        <w:pStyle w:val="Beskrivning"/>
+        <w:keepNext w:val="0"/>
+        <w:keepLines/>
+        <w:jc w:val="center"/>
+        <w:rPr>
+          <w:rFonts w:hint="eastAsia"/>
+        </w:rPr>
+      </w:pPr>
+      <w:r>
+        <w:t>Figure 6. System 2 amplification and phase shift as functions of frequency.</w:t>
       </w:r>
     </w:p>
     <w:p>
@@ -728,6 +936,7 @@
     </w:p>
     <w:p>
       <w:pPr>
+        <w:keepNext/>
         <w:spacing w:before="60" w:after="40"/>
         <w:jc w:val="center"/>
         <w:rPr>
@@ -784,7 +993,7 @@
         </w:rPr>
       </w:pPr>
       <w:r>
-        <w:t>Figure 3. Butterworth and Chebyshev Type I low-pass filters (order 5, cutoff 200 Hz).</w:t>
+        <w:t>Figure 7. Butterworth and Chebyshev Type I low-pass filters (order 5, cutoff 200 Hz).</w:t>
       </w:r>
     </w:p>
     <w:p>
@@ -807,6 +1016,7 @@
     </w:p>
     <w:p>
       <w:pPr>
+        <w:keepNext/>
         <w:spacing w:before="60" w:after="40"/>
         <w:jc w:val="center"/>
         <w:rPr>
@@ -863,7 +1073,7 @@
         </w:rPr>
       </w:pPr>
       <w:r>
-        <w:t>Figure 4. Our separate voice spectrograms, using 1,024 samples per part.</w:t>
+        <w:t>Figure 8. Our separate voice spectrograms, using 1,024 samples per part.</w:t>
       </w:r>
     </w:p>
     <w:p>
@@ -1254,14 +1464,7 @@
     </w:tbl>
     <w:p>
       <w:pPr>
-        <w:spacing w:after="0"/>
-        <w:rPr>
-          <w:rFonts w:hint="eastAsia"/>
-        </w:rPr>
-      </w:pPr>
-    </w:p>
-    <w:p>
-      <w:pPr>
+        <w:spacing w:before="80"/>
         <w:rPr>
           <w:rFonts w:hint="eastAsia"/>
         </w:rPr>

</xml_diff>